<commit_message>
Remove clip #3, add 6 new clips, dedupe uploads
Removed the old clip #3 (restaurant scene) per request. Compared
content hashes of the newly uploaded files against what was already
in videos/ and against each other: 3 were exact duplicates of existing
clips and 2 were duplicates of each other, so only the 6 genuinely new
videos were added. Now 14 clips total (clip-01..clip-14), renumbered
sequentially with matching poster thumbnails, QR codes, and updated
Word/PDF/website.
</commit_message>
<xml_diff>
--- a/media-kit/Alexis_UGC_Media_Kit.docx
+++ b/media-kit/Alexis_UGC_Media_Kit.docx
@@ -375,20 +375,25 @@
         </w:tblBorders>
       </w:tblPr>
       <w:tblGrid>
-        <w:gridCol w:w="1204"/>
-        <w:gridCol w:w="1204"/>
-        <w:gridCol w:w="1204"/>
-        <w:gridCol w:w="1204"/>
-        <w:gridCol w:w="1204"/>
-        <w:gridCol w:w="1204"/>
-        <w:gridCol w:w="1204"/>
-        <w:gridCol w:w="1204"/>
-        <w:gridCol w:w="1204"/>
+        <w:gridCol w:w="774"/>
+        <w:gridCol w:w="774"/>
+        <w:gridCol w:w="774"/>
+        <w:gridCol w:w="774"/>
+        <w:gridCol w:w="774"/>
+        <w:gridCol w:w="774"/>
+        <w:gridCol w:w="774"/>
+        <w:gridCol w:w="774"/>
+        <w:gridCol w:w="774"/>
+        <w:gridCol w:w="774"/>
+        <w:gridCol w:w="774"/>
+        <w:gridCol w:w="774"/>
+        <w:gridCol w:w="774"/>
+        <w:gridCol w:w="774"/>
       </w:tblGrid>
       <w:tr>
         <w:tc>
           <w:tcPr>
-            <w:tcW w:type="dxa" w:w="1204"/>
+            <w:tcW w:type="dxa" w:w="774"/>
             <w:tcBorders>
               <w:top w:val="none" w:color="FFFFFF" w:sz="0"/>
               <w:left w:val="none" w:color="FFFFFF" w:sz="0"/>
@@ -409,7 +414,7 @@
             <w:r>
               <w:drawing>
                 <wp:inline distT="0" distB="0" distL="0" distR="0">
-                  <wp:extent cx="438150" cy="438150"/>
+                  <wp:extent cx="381000" cy="381000"/>
                   <wp:effectExtent t="0" r="0" b="0" l="0"/>
                   <wp:docPr id="1" name="" descr="" title=""/>
                   <wp:cNvGraphicFramePr>
@@ -434,7 +439,7 @@
                         <pic:spPr bwMode="auto">
                           <a:xfrm>
                             <a:off x="0" y="0"/>
-                            <a:ext cx="438150" cy="438150"/>
+                            <a:ext cx="381000" cy="381000"/>
                           </a:xfrm>
                           <a:prstGeom prst="rect">
                             <a:avLst/>
@@ -467,7 +472,7 @@
         </w:tc>
         <w:tc>
           <w:tcPr>
-            <w:tcW w:type="dxa" w:w="1204"/>
+            <w:tcW w:type="dxa" w:w="774"/>
             <w:tcBorders>
               <w:top w:val="none" w:color="FFFFFF" w:sz="0"/>
               <w:left w:val="none" w:color="FFFFFF" w:sz="0"/>
@@ -488,7 +493,7 @@
             <w:r>
               <w:drawing>
                 <wp:inline distT="0" distB="0" distL="0" distR="0">
-                  <wp:extent cx="438150" cy="438150"/>
+                  <wp:extent cx="381000" cy="381000"/>
                   <wp:effectExtent t="0" r="0" b="0" l="0"/>
                   <wp:docPr id="1" name="" descr="" title=""/>
                   <wp:cNvGraphicFramePr>
@@ -513,7 +518,7 @@
                         <pic:spPr bwMode="auto">
                           <a:xfrm>
                             <a:off x="0" y="0"/>
-                            <a:ext cx="438150" cy="438150"/>
+                            <a:ext cx="381000" cy="381000"/>
                           </a:xfrm>
                           <a:prstGeom prst="rect">
                             <a:avLst/>
@@ -546,7 +551,7 @@
         </w:tc>
         <w:tc>
           <w:tcPr>
-            <w:tcW w:type="dxa" w:w="1204"/>
+            <w:tcW w:type="dxa" w:w="774"/>
             <w:tcBorders>
               <w:top w:val="none" w:color="FFFFFF" w:sz="0"/>
               <w:left w:val="none" w:color="FFFFFF" w:sz="0"/>
@@ -567,7 +572,7 @@
             <w:r>
               <w:drawing>
                 <wp:inline distT="0" distB="0" distL="0" distR="0">
-                  <wp:extent cx="438150" cy="438150"/>
+                  <wp:extent cx="381000" cy="381000"/>
                   <wp:effectExtent t="0" r="0" b="0" l="0"/>
                   <wp:docPr id="1" name="" descr="" title=""/>
                   <wp:cNvGraphicFramePr>
@@ -592,7 +597,7 @@
                         <pic:spPr bwMode="auto">
                           <a:xfrm>
                             <a:off x="0" y="0"/>
-                            <a:ext cx="438150" cy="438150"/>
+                            <a:ext cx="381000" cy="381000"/>
                           </a:xfrm>
                           <a:prstGeom prst="rect">
                             <a:avLst/>
@@ -625,7 +630,7 @@
         </w:tc>
         <w:tc>
           <w:tcPr>
-            <w:tcW w:type="dxa" w:w="1204"/>
+            <w:tcW w:type="dxa" w:w="774"/>
             <w:tcBorders>
               <w:top w:val="none" w:color="FFFFFF" w:sz="0"/>
               <w:left w:val="none" w:color="FFFFFF" w:sz="0"/>
@@ -646,7 +651,7 @@
             <w:r>
               <w:drawing>
                 <wp:inline distT="0" distB="0" distL="0" distR="0">
-                  <wp:extent cx="438150" cy="438150"/>
+                  <wp:extent cx="381000" cy="381000"/>
                   <wp:effectExtent t="0" r="0" b="0" l="0"/>
                   <wp:docPr id="1" name="" descr="" title=""/>
                   <wp:cNvGraphicFramePr>
@@ -671,7 +676,7 @@
                         <pic:spPr bwMode="auto">
                           <a:xfrm>
                             <a:off x="0" y="0"/>
-                            <a:ext cx="438150" cy="438150"/>
+                            <a:ext cx="381000" cy="381000"/>
                           </a:xfrm>
                           <a:prstGeom prst="rect">
                             <a:avLst/>
@@ -704,7 +709,7 @@
         </w:tc>
         <w:tc>
           <w:tcPr>
-            <w:tcW w:type="dxa" w:w="1204"/>
+            <w:tcW w:type="dxa" w:w="774"/>
             <w:tcBorders>
               <w:top w:val="none" w:color="FFFFFF" w:sz="0"/>
               <w:left w:val="none" w:color="FFFFFF" w:sz="0"/>
@@ -725,7 +730,7 @@
             <w:r>
               <w:drawing>
                 <wp:inline distT="0" distB="0" distL="0" distR="0">
-                  <wp:extent cx="438150" cy="438150"/>
+                  <wp:extent cx="381000" cy="381000"/>
                   <wp:effectExtent t="0" r="0" b="0" l="0"/>
                   <wp:docPr id="1" name="" descr="" title=""/>
                   <wp:cNvGraphicFramePr>
@@ -750,7 +755,7 @@
                         <pic:spPr bwMode="auto">
                           <a:xfrm>
                             <a:off x="0" y="0"/>
-                            <a:ext cx="438150" cy="438150"/>
+                            <a:ext cx="381000" cy="381000"/>
                           </a:xfrm>
                           <a:prstGeom prst="rect">
                             <a:avLst/>
@@ -783,7 +788,7 @@
         </w:tc>
         <w:tc>
           <w:tcPr>
-            <w:tcW w:type="dxa" w:w="1204"/>
+            <w:tcW w:type="dxa" w:w="774"/>
             <w:tcBorders>
               <w:top w:val="none" w:color="FFFFFF" w:sz="0"/>
               <w:left w:val="none" w:color="FFFFFF" w:sz="0"/>
@@ -804,7 +809,7 @@
             <w:r>
               <w:drawing>
                 <wp:inline distT="0" distB="0" distL="0" distR="0">
-                  <wp:extent cx="438150" cy="438150"/>
+                  <wp:extent cx="381000" cy="381000"/>
                   <wp:effectExtent t="0" r="0" b="0" l="0"/>
                   <wp:docPr id="1" name="" descr="" title=""/>
                   <wp:cNvGraphicFramePr>
@@ -829,7 +834,7 @@
                         <pic:spPr bwMode="auto">
                           <a:xfrm>
                             <a:off x="0" y="0"/>
-                            <a:ext cx="438150" cy="438150"/>
+                            <a:ext cx="381000" cy="381000"/>
                           </a:xfrm>
                           <a:prstGeom prst="rect">
                             <a:avLst/>
@@ -862,7 +867,7 @@
         </w:tc>
         <w:tc>
           <w:tcPr>
-            <w:tcW w:type="dxa" w:w="1204"/>
+            <w:tcW w:type="dxa" w:w="774"/>
             <w:tcBorders>
               <w:top w:val="none" w:color="FFFFFF" w:sz="0"/>
               <w:left w:val="none" w:color="FFFFFF" w:sz="0"/>
@@ -883,7 +888,7 @@
             <w:r>
               <w:drawing>
                 <wp:inline distT="0" distB="0" distL="0" distR="0">
-                  <wp:extent cx="438150" cy="438150"/>
+                  <wp:extent cx="381000" cy="381000"/>
                   <wp:effectExtent t="0" r="0" b="0" l="0"/>
                   <wp:docPr id="1" name="" descr="" title=""/>
                   <wp:cNvGraphicFramePr>
@@ -908,7 +913,7 @@
                         <pic:spPr bwMode="auto">
                           <a:xfrm>
                             <a:off x="0" y="0"/>
-                            <a:ext cx="438150" cy="438150"/>
+                            <a:ext cx="381000" cy="381000"/>
                           </a:xfrm>
                           <a:prstGeom prst="rect">
                             <a:avLst/>
@@ -941,7 +946,7 @@
         </w:tc>
         <w:tc>
           <w:tcPr>
-            <w:tcW w:type="dxa" w:w="1204"/>
+            <w:tcW w:type="dxa" w:w="774"/>
             <w:tcBorders>
               <w:top w:val="none" w:color="FFFFFF" w:sz="0"/>
               <w:left w:val="none" w:color="FFFFFF" w:sz="0"/>
@@ -962,7 +967,7 @@
             <w:r>
               <w:drawing>
                 <wp:inline distT="0" distB="0" distL="0" distR="0">
-                  <wp:extent cx="438150" cy="438150"/>
+                  <wp:extent cx="381000" cy="381000"/>
                   <wp:effectExtent t="0" r="0" b="0" l="0"/>
                   <wp:docPr id="1" name="" descr="" title=""/>
                   <wp:cNvGraphicFramePr>
@@ -987,7 +992,7 @@
                         <pic:spPr bwMode="auto">
                           <a:xfrm>
                             <a:off x="0" y="0"/>
-                            <a:ext cx="438150" cy="438150"/>
+                            <a:ext cx="381000" cy="381000"/>
                           </a:xfrm>
                           <a:prstGeom prst="rect">
                             <a:avLst/>
@@ -1020,7 +1025,7 @@
         </w:tc>
         <w:tc>
           <w:tcPr>
-            <w:tcW w:type="dxa" w:w="1204"/>
+            <w:tcW w:type="dxa" w:w="774"/>
             <w:tcBorders>
               <w:top w:val="none" w:color="FFFFFF" w:sz="0"/>
               <w:left w:val="none" w:color="FFFFFF" w:sz="0"/>
@@ -1041,7 +1046,7 @@
             <w:r>
               <w:drawing>
                 <wp:inline distT="0" distB="0" distL="0" distR="0">
-                  <wp:extent cx="438150" cy="438150"/>
+                  <wp:extent cx="381000" cy="381000"/>
                   <wp:effectExtent t="0" r="0" b="0" l="0"/>
                   <wp:docPr id="1" name="" descr="" title=""/>
                   <wp:cNvGraphicFramePr>
@@ -1066,7 +1071,7 @@
                         <pic:spPr bwMode="auto">
                           <a:xfrm>
                             <a:off x="0" y="0"/>
-                            <a:ext cx="438150" cy="438150"/>
+                            <a:ext cx="381000" cy="381000"/>
                           </a:xfrm>
                           <a:prstGeom prst="rect">
                             <a:avLst/>
@@ -1094,6 +1099,401 @@
                 <w:szCs w:val="11"/>
               </w:rPr>
               <w:t xml:space="preserve">09</w:t>
+            </w:r>
+          </w:p>
+        </w:tc>
+        <w:tc>
+          <w:tcPr>
+            <w:tcW w:type="dxa" w:w="774"/>
+            <w:tcBorders>
+              <w:top w:val="none" w:color="FFFFFF" w:sz="0"/>
+              <w:left w:val="none" w:color="FFFFFF" w:sz="0"/>
+              <w:bottom w:val="none" w:color="FFFFFF" w:sz="0"/>
+              <w:right w:val="none" w:color="FFFFFF" w:sz="0"/>
+            </w:tcBorders>
+            <w:tcMar>
+              <w:top w:type="dxa" w:w="30"/>
+              <w:left w:type="dxa" w:w="20"/>
+              <w:bottom w:type="dxa" w:w="30"/>
+              <w:right w:type="dxa" w:w="20"/>
+            </w:tcMar>
+          </w:tcPr>
+          <w:p>
+            <w:pPr>
+              <w:jc w:val="center"/>
+            </w:pPr>
+            <w:r>
+              <w:drawing>
+                <wp:inline distT="0" distB="0" distL="0" distR="0">
+                  <wp:extent cx="381000" cy="381000"/>
+                  <wp:effectExtent t="0" r="0" b="0" l="0"/>
+                  <wp:docPr id="1" name="" descr="" title=""/>
+                  <wp:cNvGraphicFramePr>
+                    <a:graphicFrameLocks xmlns:a="http://schemas.openxmlformats.org/drawingml/2006/main" noChangeAspect="1"/>
+                  </wp:cNvGraphicFramePr>
+                  <a:graphic xmlns:a="http://schemas.openxmlformats.org/drawingml/2006/main">
+                    <a:graphicData uri="http://schemas.openxmlformats.org/drawingml/2006/picture">
+                      <pic:pic xmlns:pic="http://schemas.openxmlformats.org/drawingml/2006/picture">
+                        <pic:nvPicPr>
+                          <pic:cNvPr id="0" name="" descr=""/>
+                          <pic:cNvPicPr>
+                            <a:picLocks noChangeAspect="1" noChangeArrowheads="1"/>
+                          </pic:cNvPicPr>
+                        </pic:nvPicPr>
+                        <pic:blipFill>
+                          <a:blip r:embed="rId16" cstate="none"/>
+                          <a:srcRect/>
+                          <a:stretch>
+                            <a:fillRect/>
+                          </a:stretch>
+                        </pic:blipFill>
+                        <pic:spPr bwMode="auto">
+                          <a:xfrm>
+                            <a:off x="0" y="0"/>
+                            <a:ext cx="381000" cy="381000"/>
+                          </a:xfrm>
+                          <a:prstGeom prst="rect">
+                            <a:avLst/>
+                          </a:prstGeom>
+                        </pic:spPr>
+                      </pic:pic>
+                    </a:graphicData>
+                  </a:graphic>
+                </wp:inline>
+              </w:drawing>
+            </w:r>
+          </w:p>
+          <w:p>
+            <w:pPr>
+              <w:spacing w:before="15"/>
+              <w:jc w:val="center"/>
+            </w:pPr>
+            <w:r>
+              <w:rPr>
+                <w:rFonts w:ascii="Calibri" w:cs="Calibri" w:eastAsia="Calibri" w:hAnsi="Calibri"/>
+                <w:b/>
+                <w:bCs/>
+                <w:color w:val="B0206B"/>
+                <w:sz w:val="11"/>
+                <w:szCs w:val="11"/>
+              </w:rPr>
+              <w:t xml:space="preserve">10</w:t>
+            </w:r>
+          </w:p>
+        </w:tc>
+        <w:tc>
+          <w:tcPr>
+            <w:tcW w:type="dxa" w:w="774"/>
+            <w:tcBorders>
+              <w:top w:val="none" w:color="FFFFFF" w:sz="0"/>
+              <w:left w:val="none" w:color="FFFFFF" w:sz="0"/>
+              <w:bottom w:val="none" w:color="FFFFFF" w:sz="0"/>
+              <w:right w:val="none" w:color="FFFFFF" w:sz="0"/>
+            </w:tcBorders>
+            <w:tcMar>
+              <w:top w:type="dxa" w:w="30"/>
+              <w:left w:type="dxa" w:w="20"/>
+              <w:bottom w:type="dxa" w:w="30"/>
+              <w:right w:type="dxa" w:w="20"/>
+            </w:tcMar>
+          </w:tcPr>
+          <w:p>
+            <w:pPr>
+              <w:jc w:val="center"/>
+            </w:pPr>
+            <w:r>
+              <w:drawing>
+                <wp:inline distT="0" distB="0" distL="0" distR="0">
+                  <wp:extent cx="381000" cy="381000"/>
+                  <wp:effectExtent t="0" r="0" b="0" l="0"/>
+                  <wp:docPr id="1" name="" descr="" title=""/>
+                  <wp:cNvGraphicFramePr>
+                    <a:graphicFrameLocks xmlns:a="http://schemas.openxmlformats.org/drawingml/2006/main" noChangeAspect="1"/>
+                  </wp:cNvGraphicFramePr>
+                  <a:graphic xmlns:a="http://schemas.openxmlformats.org/drawingml/2006/main">
+                    <a:graphicData uri="http://schemas.openxmlformats.org/drawingml/2006/picture">
+                      <pic:pic xmlns:pic="http://schemas.openxmlformats.org/drawingml/2006/picture">
+                        <pic:nvPicPr>
+                          <pic:cNvPr id="0" name="" descr=""/>
+                          <pic:cNvPicPr>
+                            <a:picLocks noChangeAspect="1" noChangeArrowheads="1"/>
+                          </pic:cNvPicPr>
+                        </pic:nvPicPr>
+                        <pic:blipFill>
+                          <a:blip r:embed="rId17" cstate="none"/>
+                          <a:srcRect/>
+                          <a:stretch>
+                            <a:fillRect/>
+                          </a:stretch>
+                        </pic:blipFill>
+                        <pic:spPr bwMode="auto">
+                          <a:xfrm>
+                            <a:off x="0" y="0"/>
+                            <a:ext cx="381000" cy="381000"/>
+                          </a:xfrm>
+                          <a:prstGeom prst="rect">
+                            <a:avLst/>
+                          </a:prstGeom>
+                        </pic:spPr>
+                      </pic:pic>
+                    </a:graphicData>
+                  </a:graphic>
+                </wp:inline>
+              </w:drawing>
+            </w:r>
+          </w:p>
+          <w:p>
+            <w:pPr>
+              <w:spacing w:before="15"/>
+              <w:jc w:val="center"/>
+            </w:pPr>
+            <w:r>
+              <w:rPr>
+                <w:rFonts w:ascii="Calibri" w:cs="Calibri" w:eastAsia="Calibri" w:hAnsi="Calibri"/>
+                <w:b/>
+                <w:bCs/>
+                <w:color w:val="B0206B"/>
+                <w:sz w:val="11"/>
+                <w:szCs w:val="11"/>
+              </w:rPr>
+              <w:t xml:space="preserve">11</w:t>
+            </w:r>
+          </w:p>
+        </w:tc>
+        <w:tc>
+          <w:tcPr>
+            <w:tcW w:type="dxa" w:w="774"/>
+            <w:tcBorders>
+              <w:top w:val="none" w:color="FFFFFF" w:sz="0"/>
+              <w:left w:val="none" w:color="FFFFFF" w:sz="0"/>
+              <w:bottom w:val="none" w:color="FFFFFF" w:sz="0"/>
+              <w:right w:val="none" w:color="FFFFFF" w:sz="0"/>
+            </w:tcBorders>
+            <w:tcMar>
+              <w:top w:type="dxa" w:w="30"/>
+              <w:left w:type="dxa" w:w="20"/>
+              <w:bottom w:type="dxa" w:w="30"/>
+              <w:right w:type="dxa" w:w="20"/>
+            </w:tcMar>
+          </w:tcPr>
+          <w:p>
+            <w:pPr>
+              <w:jc w:val="center"/>
+            </w:pPr>
+            <w:r>
+              <w:drawing>
+                <wp:inline distT="0" distB="0" distL="0" distR="0">
+                  <wp:extent cx="381000" cy="381000"/>
+                  <wp:effectExtent t="0" r="0" b="0" l="0"/>
+                  <wp:docPr id="1" name="" descr="" title=""/>
+                  <wp:cNvGraphicFramePr>
+                    <a:graphicFrameLocks xmlns:a="http://schemas.openxmlformats.org/drawingml/2006/main" noChangeAspect="1"/>
+                  </wp:cNvGraphicFramePr>
+                  <a:graphic xmlns:a="http://schemas.openxmlformats.org/drawingml/2006/main">
+                    <a:graphicData uri="http://schemas.openxmlformats.org/drawingml/2006/picture">
+                      <pic:pic xmlns:pic="http://schemas.openxmlformats.org/drawingml/2006/picture">
+                        <pic:nvPicPr>
+                          <pic:cNvPr id="0" name="" descr=""/>
+                          <pic:cNvPicPr>
+                            <a:picLocks noChangeAspect="1" noChangeArrowheads="1"/>
+                          </pic:cNvPicPr>
+                        </pic:nvPicPr>
+                        <pic:blipFill>
+                          <a:blip r:embed="rId18" cstate="none"/>
+                          <a:srcRect/>
+                          <a:stretch>
+                            <a:fillRect/>
+                          </a:stretch>
+                        </pic:blipFill>
+                        <pic:spPr bwMode="auto">
+                          <a:xfrm>
+                            <a:off x="0" y="0"/>
+                            <a:ext cx="381000" cy="381000"/>
+                          </a:xfrm>
+                          <a:prstGeom prst="rect">
+                            <a:avLst/>
+                          </a:prstGeom>
+                        </pic:spPr>
+                      </pic:pic>
+                    </a:graphicData>
+                  </a:graphic>
+                </wp:inline>
+              </w:drawing>
+            </w:r>
+          </w:p>
+          <w:p>
+            <w:pPr>
+              <w:spacing w:before="15"/>
+              <w:jc w:val="center"/>
+            </w:pPr>
+            <w:r>
+              <w:rPr>
+                <w:rFonts w:ascii="Calibri" w:cs="Calibri" w:eastAsia="Calibri" w:hAnsi="Calibri"/>
+                <w:b/>
+                <w:bCs/>
+                <w:color w:val="B0206B"/>
+                <w:sz w:val="11"/>
+                <w:szCs w:val="11"/>
+              </w:rPr>
+              <w:t xml:space="preserve">12</w:t>
+            </w:r>
+          </w:p>
+        </w:tc>
+        <w:tc>
+          <w:tcPr>
+            <w:tcW w:type="dxa" w:w="774"/>
+            <w:tcBorders>
+              <w:top w:val="none" w:color="FFFFFF" w:sz="0"/>
+              <w:left w:val="none" w:color="FFFFFF" w:sz="0"/>
+              <w:bottom w:val="none" w:color="FFFFFF" w:sz="0"/>
+              <w:right w:val="none" w:color="FFFFFF" w:sz="0"/>
+            </w:tcBorders>
+            <w:tcMar>
+              <w:top w:type="dxa" w:w="30"/>
+              <w:left w:type="dxa" w:w="20"/>
+              <w:bottom w:type="dxa" w:w="30"/>
+              <w:right w:type="dxa" w:w="20"/>
+            </w:tcMar>
+          </w:tcPr>
+          <w:p>
+            <w:pPr>
+              <w:jc w:val="center"/>
+            </w:pPr>
+            <w:r>
+              <w:drawing>
+                <wp:inline distT="0" distB="0" distL="0" distR="0">
+                  <wp:extent cx="381000" cy="381000"/>
+                  <wp:effectExtent t="0" r="0" b="0" l="0"/>
+                  <wp:docPr id="1" name="" descr="" title=""/>
+                  <wp:cNvGraphicFramePr>
+                    <a:graphicFrameLocks xmlns:a="http://schemas.openxmlformats.org/drawingml/2006/main" noChangeAspect="1"/>
+                  </wp:cNvGraphicFramePr>
+                  <a:graphic xmlns:a="http://schemas.openxmlformats.org/drawingml/2006/main">
+                    <a:graphicData uri="http://schemas.openxmlformats.org/drawingml/2006/picture">
+                      <pic:pic xmlns:pic="http://schemas.openxmlformats.org/drawingml/2006/picture">
+                        <pic:nvPicPr>
+                          <pic:cNvPr id="0" name="" descr=""/>
+                          <pic:cNvPicPr>
+                            <a:picLocks noChangeAspect="1" noChangeArrowheads="1"/>
+                          </pic:cNvPicPr>
+                        </pic:nvPicPr>
+                        <pic:blipFill>
+                          <a:blip r:embed="rId19" cstate="none"/>
+                          <a:srcRect/>
+                          <a:stretch>
+                            <a:fillRect/>
+                          </a:stretch>
+                        </pic:blipFill>
+                        <pic:spPr bwMode="auto">
+                          <a:xfrm>
+                            <a:off x="0" y="0"/>
+                            <a:ext cx="381000" cy="381000"/>
+                          </a:xfrm>
+                          <a:prstGeom prst="rect">
+                            <a:avLst/>
+                          </a:prstGeom>
+                        </pic:spPr>
+                      </pic:pic>
+                    </a:graphicData>
+                  </a:graphic>
+                </wp:inline>
+              </w:drawing>
+            </w:r>
+          </w:p>
+          <w:p>
+            <w:pPr>
+              <w:spacing w:before="15"/>
+              <w:jc w:val="center"/>
+            </w:pPr>
+            <w:r>
+              <w:rPr>
+                <w:rFonts w:ascii="Calibri" w:cs="Calibri" w:eastAsia="Calibri" w:hAnsi="Calibri"/>
+                <w:b/>
+                <w:bCs/>
+                <w:color w:val="B0206B"/>
+                <w:sz w:val="11"/>
+                <w:szCs w:val="11"/>
+              </w:rPr>
+              <w:t xml:space="preserve">13</w:t>
+            </w:r>
+          </w:p>
+        </w:tc>
+        <w:tc>
+          <w:tcPr>
+            <w:tcW w:type="dxa" w:w="774"/>
+            <w:tcBorders>
+              <w:top w:val="none" w:color="FFFFFF" w:sz="0"/>
+              <w:left w:val="none" w:color="FFFFFF" w:sz="0"/>
+              <w:bottom w:val="none" w:color="FFFFFF" w:sz="0"/>
+              <w:right w:val="none" w:color="FFFFFF" w:sz="0"/>
+            </w:tcBorders>
+            <w:tcMar>
+              <w:top w:type="dxa" w:w="30"/>
+              <w:left w:type="dxa" w:w="20"/>
+              <w:bottom w:type="dxa" w:w="30"/>
+              <w:right w:type="dxa" w:w="20"/>
+            </w:tcMar>
+          </w:tcPr>
+          <w:p>
+            <w:pPr>
+              <w:jc w:val="center"/>
+            </w:pPr>
+            <w:r>
+              <w:drawing>
+                <wp:inline distT="0" distB="0" distL="0" distR="0">
+                  <wp:extent cx="381000" cy="381000"/>
+                  <wp:effectExtent t="0" r="0" b="0" l="0"/>
+                  <wp:docPr id="1" name="" descr="" title=""/>
+                  <wp:cNvGraphicFramePr>
+                    <a:graphicFrameLocks xmlns:a="http://schemas.openxmlformats.org/drawingml/2006/main" noChangeAspect="1"/>
+                  </wp:cNvGraphicFramePr>
+                  <a:graphic xmlns:a="http://schemas.openxmlformats.org/drawingml/2006/main">
+                    <a:graphicData uri="http://schemas.openxmlformats.org/drawingml/2006/picture">
+                      <pic:pic xmlns:pic="http://schemas.openxmlformats.org/drawingml/2006/picture">
+                        <pic:nvPicPr>
+                          <pic:cNvPr id="0" name="" descr=""/>
+                          <pic:cNvPicPr>
+                            <a:picLocks noChangeAspect="1" noChangeArrowheads="1"/>
+                          </pic:cNvPicPr>
+                        </pic:nvPicPr>
+                        <pic:blipFill>
+                          <a:blip r:embed="rId20" cstate="none"/>
+                          <a:srcRect/>
+                          <a:stretch>
+                            <a:fillRect/>
+                          </a:stretch>
+                        </pic:blipFill>
+                        <pic:spPr bwMode="auto">
+                          <a:xfrm>
+                            <a:off x="0" y="0"/>
+                            <a:ext cx="381000" cy="381000"/>
+                          </a:xfrm>
+                          <a:prstGeom prst="rect">
+                            <a:avLst/>
+                          </a:prstGeom>
+                        </pic:spPr>
+                      </pic:pic>
+                    </a:graphicData>
+                  </a:graphic>
+                </wp:inline>
+              </w:drawing>
+            </w:r>
+          </w:p>
+          <w:p>
+            <w:pPr>
+              <w:spacing w:before="15"/>
+              <w:jc w:val="center"/>
+            </w:pPr>
+            <w:r>
+              <w:rPr>
+                <w:rFonts w:ascii="Calibri" w:cs="Calibri" w:eastAsia="Calibri" w:hAnsi="Calibri"/>
+                <w:b/>
+                <w:bCs/>
+                <w:color w:val="B0206B"/>
+                <w:sz w:val="11"/>
+                <w:szCs w:val="11"/>
+              </w:rPr>
+              <w:t xml:space="preserve">14</w:t>
             </w:r>
           </w:p>
         </w:tc>

</xml_diff>